<commit_message>
Updated with price and QR code.
</commit_message>
<xml_diff>
--- a/images/posts/2024/2024-09-03-art-on-paper/press-release.docx
+++ b/images/posts/2024/2024-09-03-art-on-paper/press-release.docx
@@ -41,8 +41,11 @@
         <w:fldChar w:fldCharType="separate"/>
       </w:r>
       <w:r>
+        <w:rPr>
+          <w:noProof/>
+        </w:rPr>
         <w:drawing>
-          <wp:inline distT="0" distB="0" distL="0" distR="0" wp14:anchorId="70E496B5" wp14:editId="73097FEA">
+          <wp:inline distT="0" distB="0" distL="0" distR="0" wp14:anchorId="70E496B5" wp14:editId="6891B5F1">
             <wp:extent cx="2743200" cy="2743200"/>
             <wp:effectExtent l="0" t="0" r="0" b="0"/>
             <wp:docPr id="214368341" name="Picture 30" descr="A yellow logo on a black background&#10;&#10;Description automatically generated"/>
@@ -106,8 +109,11 @@
         <w:fldChar w:fldCharType="separate"/>
       </w:r>
       <w:r>
+        <w:rPr>
+          <w:noProof/>
+        </w:rPr>
         <w:drawing>
-          <wp:inline distT="0" distB="0" distL="0" distR="0" wp14:anchorId="4B1E10B0" wp14:editId="4D81438E">
+          <wp:inline distT="0" distB="0" distL="0" distR="0" wp14:anchorId="4B1E10B0" wp14:editId="499B5ED4">
             <wp:extent cx="2743200" cy="2743200"/>
             <wp:effectExtent l="0" t="0" r="0" b="0"/>
             <wp:docPr id="1474082079" name="Picture 32" descr="A white cube with a black background&#10;&#10;Description automatically generated"/>
@@ -174,8 +180,11 @@
         <w:fldChar w:fldCharType="separate"/>
       </w:r>
       <w:r>
+        <w:rPr>
+          <w:noProof/>
+        </w:rPr>
         <w:drawing>
-          <wp:inline distT="0" distB="0" distL="0" distR="0" wp14:anchorId="74A80BB1" wp14:editId="3CC0DA3E">
+          <wp:inline distT="0" distB="0" distL="0" distR="0" wp14:anchorId="74A80BB1" wp14:editId="23D1FB1D">
             <wp:extent cx="2743200" cy="2743200"/>
             <wp:effectExtent l="0" t="0" r="0" b="0"/>
             <wp:docPr id="1738825202" name="Picture 31" descr="A white cubes on a black background&#10;&#10;Description automatically generated"/>
@@ -239,8 +248,11 @@
         <w:fldChar w:fldCharType="separate"/>
       </w:r>
       <w:r>
+        <w:rPr>
+          <w:noProof/>
+        </w:rPr>
         <w:drawing>
-          <wp:inline distT="0" distB="0" distL="0" distR="0" wp14:anchorId="3F4C6616" wp14:editId="63E0A904">
+          <wp:inline distT="0" distB="0" distL="0" distR="0" wp14:anchorId="3F4C6616" wp14:editId="5031DC01">
             <wp:extent cx="2743200" cy="2743200"/>
             <wp:effectExtent l="0" t="0" r="0" b="0"/>
             <wp:docPr id="771477959" name="Picture 29" descr="A black square with white lines&#10;&#10;Description automatically generated"/>
@@ -333,6 +345,9 @@
         <w:fldChar w:fldCharType="separate"/>
       </w:r>
       <w:r>
+        <w:rPr>
+          <w:noProof/>
+        </w:rPr>
         <w:drawing>
           <wp:inline distT="0" distB="0" distL="0" distR="0" wp14:anchorId="443F0753" wp14:editId="453A2D17">
             <wp:extent cx="2743200" cy="2743200"/>
@@ -393,13 +408,7 @@
     <w:p/>
     <w:p>
       <w:r>
-        <w:t xml:space="preserve">I don’t have answers to any of these questions, </w:t>
-      </w:r>
-      <w:r>
-        <w:t>but</w:t>
-      </w:r>
-      <w:r>
-        <w:t xml:space="preserve"> to quote Man Ray, </w:t>
+        <w:t>I don’t have answers to any of these questions, but to quote Man Ray, </w:t>
       </w:r>
       <w:r>
         <w:rPr>
@@ -468,6 +477,9 @@
         <w:fldChar w:fldCharType="separate"/>
       </w:r>
       <w:r>
+        <w:rPr>
+          <w:noProof/>
+        </w:rPr>
         <w:drawing>
           <wp:inline distT="0" distB="0" distL="0" distR="0" wp14:anchorId="4108CE66" wp14:editId="63EDA1D8">
             <wp:extent cx="2743200" cy="2743200"/>
@@ -533,6 +545,9 @@
         <w:fldChar w:fldCharType="separate"/>
       </w:r>
       <w:r>
+        <w:rPr>
+          <w:noProof/>
+        </w:rPr>
         <w:drawing>
           <wp:inline distT="0" distB="0" distL="0" distR="0" wp14:anchorId="6250E7EC" wp14:editId="029A6145">
             <wp:extent cx="2743200" cy="2743200"/>
@@ -611,6 +626,170 @@
         <w:t>.</w:t>
       </w:r>
     </w:p>
+    <w:p>
+      <w:pPr>
+        <w:jc w:val="center"/>
+        <w:rPr>
+          <w:sz w:val="36"/>
+          <w:szCs w:val="36"/>
+        </w:rPr>
+      </w:pPr>
+      <w:r>
+        <w:rPr>
+          <w:sz w:val="36"/>
+          <w:szCs w:val="36"/>
+        </w:rPr>
+        <w:lastRenderedPageBreak/>
+        <w:t>Daniel Doubrovkine</w:t>
+      </w:r>
+    </w:p>
+    <w:p>
+      <w:pPr>
+        <w:jc w:val="center"/>
+        <w:rPr>
+          <w:sz w:val="44"/>
+          <w:szCs w:val="44"/>
+        </w:rPr>
+      </w:pPr>
+      <w:r>
+        <w:rPr>
+          <w:noProof/>
+          <w:sz w:val="44"/>
+          <w:szCs w:val="44"/>
+        </w:rPr>
+        <w:drawing>
+          <wp:inline distT="0" distB="0" distL="0" distR="0" wp14:anchorId="40D85B51" wp14:editId="4D601B92">
+            <wp:extent cx="2882900" cy="2882900"/>
+            <wp:effectExtent l="0" t="0" r="0" b="0"/>
+            <wp:docPr id="917979653" name="Picture 1" descr="A qr code on a white background&#10;&#10;Description automatically generated"/>
+            <wp:cNvGraphicFramePr>
+              <a:graphicFrameLocks xmlns:a="http://schemas.openxmlformats.org/drawingml/2006/main" noChangeAspect="1"/>
+            </wp:cNvGraphicFramePr>
+            <a:graphic xmlns:a="http://schemas.openxmlformats.org/drawingml/2006/main">
+              <a:graphicData uri="http://schemas.openxmlformats.org/drawingml/2006/picture">
+                <pic:pic xmlns:pic="http://schemas.openxmlformats.org/drawingml/2006/picture">
+                  <pic:nvPicPr>
+                    <pic:cNvPr id="917979653" name="Picture 1" descr="A qr code on a white background&#10;&#10;Description automatically generated"/>
+                    <pic:cNvPicPr/>
+                  </pic:nvPicPr>
+                  <pic:blipFill>
+                    <a:blip r:embed="rId14">
+                      <a:extLst>
+                        <a:ext uri="{28A0092B-C50C-407E-A947-70E740481C1C}">
+                          <a14:useLocalDpi xmlns:a14="http://schemas.microsoft.com/office/drawing/2010/main" val="0"/>
+                        </a:ext>
+                      </a:extLst>
+                    </a:blip>
+                    <a:stretch>
+                      <a:fillRect/>
+                    </a:stretch>
+                  </pic:blipFill>
+                  <pic:spPr>
+                    <a:xfrm>
+                      <a:off x="0" y="0"/>
+                      <a:ext cx="2882900" cy="2882900"/>
+                    </a:xfrm>
+                    <a:prstGeom prst="rect">
+                      <a:avLst/>
+                    </a:prstGeom>
+                  </pic:spPr>
+                </pic:pic>
+              </a:graphicData>
+            </a:graphic>
+          </wp:inline>
+        </w:drawing>
+      </w:r>
+    </w:p>
+    <w:p>
+      <w:pPr>
+        <w:jc w:val="center"/>
+        <w:rPr>
+          <w:sz w:val="36"/>
+          <w:szCs w:val="36"/>
+        </w:rPr>
+      </w:pPr>
+      <w:r>
+        <w:rPr>
+          <w:sz w:val="36"/>
+          <w:szCs w:val="36"/>
+        </w:rPr>
+        <w:t>f</w:t>
+      </w:r>
+      <w:r>
+        <w:rPr>
+          <w:sz w:val="36"/>
+          <w:szCs w:val="36"/>
+        </w:rPr>
+        <w:t>ramed: $</w:t>
+      </w:r>
+      <w:r>
+        <w:rPr>
+          <w:b/>
+          <w:bCs/>
+          <w:sz w:val="36"/>
+          <w:szCs w:val="36"/>
+        </w:rPr>
+        <w:t>200</w:t>
+      </w:r>
+    </w:p>
+    <w:p>
+      <w:pPr>
+        <w:jc w:val="center"/>
+        <w:rPr>
+          <w:sz w:val="36"/>
+          <w:szCs w:val="36"/>
+        </w:rPr>
+      </w:pPr>
+      <w:r>
+        <w:rPr>
+          <w:sz w:val="36"/>
+          <w:szCs w:val="36"/>
+        </w:rPr>
+        <w:t>u</w:t>
+      </w:r>
+      <w:r>
+        <w:rPr>
+          <w:sz w:val="36"/>
+          <w:szCs w:val="36"/>
+        </w:rPr>
+        <w:t>nframed: $</w:t>
+      </w:r>
+      <w:r>
+        <w:rPr>
+          <w:b/>
+          <w:bCs/>
+          <w:sz w:val="36"/>
+          <w:szCs w:val="36"/>
+        </w:rPr>
+        <w:t>150</w:t>
+      </w:r>
+    </w:p>
+    <w:p>
+      <w:pPr>
+        <w:jc w:val="center"/>
+        <w:rPr>
+          <w:sz w:val="36"/>
+          <w:szCs w:val="36"/>
+        </w:rPr>
+      </w:pPr>
+      <w:r>
+        <w:rPr>
+          <w:sz w:val="36"/>
+          <w:szCs w:val="36"/>
+        </w:rPr>
+        <w:t xml:space="preserve">NFT: </w:t>
+      </w:r>
+      <w:r>
+        <w:rPr>
+          <w:b/>
+          <w:bCs/>
+          <w:sz w:val="36"/>
+          <w:szCs w:val="36"/>
+        </w:rPr>
+        <w:t>1-50 XTZ</w:t>
+      </w:r>
+    </w:p>
+    <w:p/>
     <w:sectPr>
       <w:pgSz w:w="12240" w:h="15840"/>
       <w:pgMar w:top="1440" w:right="1440" w:bottom="1440" w:left="1440" w:header="720" w:footer="720" w:gutter="0"/>
@@ -1530,6 +1709,7 @@
   <w:style w:type="character" w:default="1" w:styleId="DefaultParagraphFont">
     <w:name w:val="Default Paragraph Font"/>
     <w:uiPriority w:val="1"/>
+    <w:semiHidden/>
     <w:unhideWhenUsed/>
   </w:style>
   <w:style w:type="table" w:default="1" w:styleId="TableNormal">

</xml_diff>